<commit_message>
Fill README/report with successful CI run links and SAST/SCA screenshots
</commit_message>
<xml_diff>
--- a/report/Lab1_Report_Work1_Zheng_Junyi.docx
+++ b/report/Lab1_Report_Work1_Zheng_Junyi.docx
@@ -245,7 +245,7 @@
           <w:color w:val="000000"/>
           <w:sz w:val="21"/>
         </w:rPr>
-        <w:t>Version control: git repository initialised locally and linked to GitHub (repository URL: 【待补：GitHub 仓库链接】).</w:t>
+        <w:t>Version control: git repository initialised locally and linked to GitHub (repository URL: https://github.com/zhengjunyi23-source/lab1-secure-api).</w:t>
       </w:r>
     </w:p>
     <w:p>
@@ -971,7 +971,117 @@
           <w:color w:val="000000"/>
           <w:sz w:val="21"/>
         </w:rPr>
-        <w:t>GitHub Actions run result and scanner-report screenshots: 【待补：最后一次 pipeline run 链接及 SAST/SCA 报告截图】.</w:t>
+        <w:t>GitHub Actions run result: the last successful run (#2, commit 8f9a331) on main passed every step, including the SAST (Bandit) and SCA (Safety) scans, and uploaded the scanner reports as artifacts. Run link: https://github.com/zhengjunyi23-source/lab1-secure-api/actions/runs/40442950773</w:t>
+      </w:r>
+    </w:p>
+    <w:p>
+      <w:pPr>
+        <w:spacing w:before="120"/>
+        <w:jc w:val="center"/>
+      </w:pPr>
+      <w:r>
+        <w:drawing>
+          <wp:inline xmlns:a="http://schemas.openxmlformats.org/drawingml/2006/main" xmlns:pic="http://schemas.openxmlformats.org/drawingml/2006/picture">
+            <wp:extent cx="5580000" cy="3138750"/>
+            <wp:docPr id="1" name="Picture 1"/>
+            <wp:cNvGraphicFramePr>
+              <a:graphicFrameLocks noChangeAspect="1"/>
+            </wp:cNvGraphicFramePr>
+            <a:graphic>
+              <a:graphicData uri="http://schemas.openxmlformats.org/drawingml/2006/picture">
+                <pic:pic>
+                  <pic:nvPicPr>
+                    <pic:cNvPr id="0" name="ci-job-steps.png"/>
+                    <pic:cNvPicPr/>
+                  </pic:nvPicPr>
+                  <pic:blipFill>
+                    <a:blip r:embed="rId9"/>
+                    <a:stretch>
+                      <a:fillRect/>
+                    </a:stretch>
+                  </pic:blipFill>
+                  <pic:spPr>
+                    <a:xfrm>
+                      <a:off x="0" y="0"/>
+                      <a:ext cx="5580000" cy="3138750"/>
+                    </a:xfrm>
+                    <a:prstGeom prst="rect"/>
+                  </pic:spPr>
+                </pic:pic>
+              </a:graphicData>
+            </a:graphic>
+          </wp:inline>
+        </w:drawing>
+      </w:r>
+    </w:p>
+    <w:p>
+      <w:pPr>
+        <w:spacing w:before="40" w:after="120"/>
+        <w:jc w:val="center"/>
+      </w:pPr>
+      <w:r>
+        <w:rPr>
+          <w:rFonts w:ascii="Times New Roman" w:hAnsi="Times New Roman" w:eastAsia="宋体"/>
+          <w:b/>
+          <w:color w:val="000000"/>
+          <w:sz w:val="18"/>
+        </w:rPr>
+        <w:t>Figure 1. GitHub Actions job steps — tests, SAST (Bandit) and SCA (Safety) all green</w:t>
+      </w:r>
+    </w:p>
+    <w:p>
+      <w:pPr>
+        <w:spacing w:before="120"/>
+        <w:jc w:val="center"/>
+      </w:pPr>
+      <w:r>
+        <w:drawing>
+          <wp:inline xmlns:a="http://schemas.openxmlformats.org/drawingml/2006/main" xmlns:pic="http://schemas.openxmlformats.org/drawingml/2006/picture">
+            <wp:extent cx="5580000" cy="3138750"/>
+            <wp:docPr id="2" name="Picture 2"/>
+            <wp:cNvGraphicFramePr>
+              <a:graphicFrameLocks noChangeAspect="1"/>
+            </wp:cNvGraphicFramePr>
+            <a:graphic>
+              <a:graphicData uri="http://schemas.openxmlformats.org/drawingml/2006/picture">
+                <pic:pic>
+                  <pic:nvPicPr>
+                    <pic:cNvPr id="0" name="sast-bandit.png"/>
+                    <pic:cNvPicPr/>
+                  </pic:nvPicPr>
+                  <pic:blipFill>
+                    <a:blip r:embed="rId10"/>
+                    <a:stretch>
+                      <a:fillRect/>
+                    </a:stretch>
+                  </pic:blipFill>
+                  <pic:spPr>
+                    <a:xfrm>
+                      <a:off x="0" y="0"/>
+                      <a:ext cx="5580000" cy="3138750"/>
+                    </a:xfrm>
+                    <a:prstGeom prst="rect"/>
+                  </pic:spPr>
+                </pic:pic>
+              </a:graphicData>
+            </a:graphic>
+          </wp:inline>
+        </w:drawing>
+      </w:r>
+    </w:p>
+    <w:p>
+      <w:pPr>
+        <w:spacing w:before="40" w:after="120"/>
+        <w:jc w:val="center"/>
+      </w:pPr>
+      <w:r>
+        <w:rPr>
+          <w:rFonts w:ascii="Times New Roman" w:hAnsi="Times New Roman" w:eastAsia="宋体"/>
+          <w:b/>
+          <w:color w:val="000000"/>
+          <w:sz w:val="18"/>
+        </w:rPr>
+        <w:t>Figure 2. Bandit (SAST) report — 188 lines of code, 0 issues</w:t>
       </w:r>
     </w:p>
     <w:p>
@@ -1556,7 +1666,7 @@
           <w:color w:val="000000"/>
           <w:sz w:val="21"/>
         </w:rPr>
-        <w:t>Public git repository with the project code: 【待补：GitHub 仓库链接】</w:t>
+        <w:t>Public git repository with the project code: https://github.com/zhengjunyi23-source/lab1-secure-api</w:t>
       </w:r>
     </w:p>
     <w:p>
@@ -1586,7 +1696,7 @@
           <w:color w:val="000000"/>
           <w:sz w:val="21"/>
         </w:rPr>
-        <w:t>Link to the last successful pipeline run: 【待补：Actions 运行链接】</w:t>
+        <w:t>Link to the last successful pipeline run: https://github.com/zhengjunyi23-source/lab1-secure-api/actions/runs/40442950773</w:t>
       </w:r>
     </w:p>
     <w:p>

</xml_diff>

<commit_message>
Update report with warning-free CI screenshot and clean run link; refresh README image
</commit_message>
<xml_diff>
--- a/report/Lab1_Report_Work1_Zheng_Junyi.docx
+++ b/report/Lab1_Report_Work1_Zheng_Junyi.docx
@@ -971,7 +971,7 @@
           <w:color w:val="000000"/>
           <w:sz w:val="21"/>
         </w:rPr>
-        <w:t>GitHub Actions run result: the last successful run (#2, commit 8f9a331) on main passed every step, including the SAST (Bandit) and SCA (Safety) scans, and uploaded the scanner reports as artifacts. Run link: https://github.com/zhengjunyi23-source/lab1-secure-api/actions/runs/40442950773</w:t>
+        <w:t>GitHub Actions run result: the last successful run (#4, commit 4c674c5) on main passed every step **with no warnings**, including the SAST (Bandit) and SCA (Safety) scans, and uploaded the scanner reports as artifacts. Run link: https://github.com/zhengjunyi23-source/lab1-secure-api/actions/runs/40618883583</w:t>
       </w:r>
     </w:p>
     <w:p>
@@ -1696,7 +1696,7 @@
           <w:color w:val="000000"/>
           <w:sz w:val="21"/>
         </w:rPr>
-        <w:t>Link to the last successful pipeline run: https://github.com/zhengjunyi23-source/lab1-secure-api/actions/runs/40442950773</w:t>
+        <w:t>Link to the last successful pipeline run: https://github.com/zhengjunyi23-source/lab1-secure-api/actions/runs/40618883583</w:t>
       </w:r>
     </w:p>
     <w:p>

</xml_diff>